<commit_message>
Upload and Review Docs about project
</commit_message>
<xml_diff>
--- a/docs/Relatorio_ISI_TP1_29382.docx
+++ b/docs/Relatorio_ISI_TP1_29382.docx
@@ -16,7 +16,7 @@
           <wp:inline distT="0" distB="0" distL="0" distR="0">
             <wp:extent cx="2015999" cy="823199"/>
             <wp:effectExtent l="0" t="0" r="0" b="0"/>
-            <wp:docPr id="120" name="Imagem 120" descr="Logótipo da Universidade Politécnica do Cávado e do Ave"/>
+            <wp:docPr id="121" name="Imagem 121" descr="Logótipo da Universidade Politécnica do Cávado e do Ave"/>
             <wp:cNvGraphicFramePr>
               <a:graphicFrameLocks xmlns:a="http://schemas.openxmlformats.org/drawingml/2006/main" noChangeAspect="1"/>
             </wp:cNvGraphicFramePr>
@@ -24,7 +24,7 @@
               <a:graphicData uri="http://schemas.openxmlformats.org/drawingml/2006/picture">
                 <pic:pic xmlns:pic="http://schemas.openxmlformats.org/drawingml/2006/picture">
                   <pic:nvPicPr>
-                    <pic:cNvPr id="120" name="Imagem 120"/>
+                    <pic:cNvPr id="121" name="Imagem 121"/>
                     <pic:cNvPicPr/>
                   </pic:nvPicPr>
                   <pic:blipFill>
@@ -59,7 +59,7 @@
           <wp:inline distT="0" distB="0" distL="0" distR="0">
             <wp:extent cx="1655999" cy="568559"/>
             <wp:effectExtent l="0" t="0" r="0" b="0"/>
-            <wp:docPr id="121" name="Imagem 121" descr="Logótipo da Escola Superior de Tecnologia"/>
+            <wp:docPr id="122" name="Imagem 122" descr="Logótipo da Escola Superior de Tecnologia"/>
             <wp:cNvGraphicFramePr>
               <a:graphicFrameLocks xmlns:a="http://schemas.openxmlformats.org/drawingml/2006/main" noChangeAspect="1"/>
             </wp:cNvGraphicFramePr>
@@ -67,7 +67,7 @@
               <a:graphicData uri="http://schemas.openxmlformats.org/drawingml/2006/picture">
                 <pic:pic xmlns:pic="http://schemas.openxmlformats.org/drawingml/2006/picture">
                   <pic:nvPicPr>
-                    <pic:cNvPr id="121" name="Imagem 121"/>
+                    <pic:cNvPr id="122" name="Imagem 122"/>
                     <pic:cNvPicPr/>
                   </pic:nvPicPr>
                   <pic:blipFill>
@@ -3520,7 +3520,7 @@
             <w:sz w:val="22"/>
             <w:szCs w:val="22"/>
           </w:rPr>
-          <w:t xml:space="preserve">Ligação e Variáveis Dinâmicas no Grafana</w:t>
+          <w:t xml:space="preserve">Ligação do Grafana à Base de Dados</w:t>
         </w:r>
         <w:r>
           <w:tab/>
@@ -3965,7 +3965,7 @@
             <w:sz w:val="22"/>
             <w:szCs w:val="22"/>
           </w:rPr>
-          <w:t xml:space="preserve">32</w:t>
+          <w:t xml:space="preserve">33</w:t>
         </w:r>
         <w:r>
           <w:rPr>
@@ -19004,7 +19004,7 @@
     </w:p>
     <w:p>
       <w:r>
-        <w:t xml:space="preserve">Este capítulo apresenta a componente final da fase «L»: a visualização dinâmica dos dados persistidos, realizada no Grafana. Descrevem-se a ligação à BD e as variáveis de filtragem, os quatro painéis do </w:t>
+        <w:t xml:space="preserve">Este capítulo apresenta a componente final da fase «L»: a visualização dinâmica dos dados persistidos, realizada no Grafana. Descrevem-se a ligação à BD, o processo de construção de um painel, os quatro painéis do </w:t>
       </w:r>
       <w:r>
         <w:rPr>
@@ -19025,7 +19025,7 @@
       </w:pPr>
       <w:bookmarkStart w:id="188" w:name="_Toc_vars"/>
       <w:r>
-        <w:t xml:space="preserve">Ligação e Variáveis Dinâmicas no Grafana</w:t>
+        <w:t xml:space="preserve">Ligação do Grafana à Base de Dados</w:t>
       </w:r>
       <w:bookmarkEnd w:id="188"/>
     </w:p>
@@ -19042,7 +19042,17 @@
         <w:t xml:space="preserve">tech_power_grafana</w:t>
       </w:r>
       <w:r>
-        <w:t xml:space="preserve">, foi ligado ao PostgreSQL através da fonte de dados </w:t>
+        <w:t xml:space="preserve">, foi ligado ao PostgreSQL através de uma fonte de dados do tipo </w:t>
+      </w:r>
+      <w:r>
+        <w:rPr>
+          <w:i/>
+          <w:iCs/>
+        </w:rPr>
+        <w:t xml:space="preserve">PostgreSQL</w:t>
+      </w:r>
+      <w:r>
+        <w:t xml:space="preserve">, designada </w:t>
       </w:r>
       <w:r>
         <w:rPr>
@@ -19053,7 +19063,7 @@
         <w:t xml:space="preserve">grafana-postgresql-datasource-1</w:t>
       </w:r>
       <w:r>
-        <w:t xml:space="preserve">, configurada para a BD do contentor </w:t>
+        <w:t xml:space="preserve"> e apontada à BD </w:t>
       </w:r>
       <w:r>
         <w:rPr>
@@ -19061,30 +19071,10 @@
           <w:sz w:val="21"/>
           <w:szCs w:val="21"/>
         </w:rPr>
-        <w:t xml:space="preserve">tech_power_db</w:t>
-      </w:r>
-      <w:r>
-        <w:t xml:space="preserve">. Sobre esta fonte de dados foram criadas duas variáveis globais do tipo </w:t>
-      </w:r>
-      <w:r>
-        <w:rPr>
-          <w:i/>
-          <w:iCs/>
-        </w:rPr>
-        <w:t xml:space="preserve">Query</w:t>
-      </w:r>
-      <w:r>
-        <w:t xml:space="preserve">, que alimentam listas de seleção no topo do </w:t>
-      </w:r>
-      <w:r>
-        <w:rPr>
-          <w:i/>
-          <w:iCs/>
-        </w:rPr>
-        <w:t xml:space="preserve">dashboard</w:t>
-      </w:r>
-      <w:r>
-        <w:t xml:space="preserve"> e permitem filtrar todos os painéis em simultâneo. Ambas consultam a tabela </w:t>
+        <w:t xml:space="preserve">tech_purchasing_power</w:t>
+      </w:r>
+      <w:r>
+        <w:t xml:space="preserve"> do contentor </w:t>
       </w:r>
       <w:r>
         <w:rPr>
@@ -19092,325 +19082,84 @@
           <w:sz w:val="21"/>
           <w:szCs w:val="21"/>
         </w:rPr>
+        <w:t xml:space="preserve">tech_power_db</w:t>
+      </w:r>
+      <w:r>
+        <w:t xml:space="preserve">. Todos os painéis consultam a tabela </w:t>
+      </w:r>
+      <w:r>
+        <w:rPr>
+          <w:rFonts w:ascii="Courier New" w:hAnsi="Courier New" w:cs="Courier New"/>
+          <w:sz w:val="21"/>
+          <w:szCs w:val="21"/>
+        </w:rPr>
         <w:t xml:space="preserve">ofertas_emprego</w:t>
       </w:r>
       <w:r>
-        <w:t xml:space="preserve">, que é a base analítica enriquecida.</w:t>
-      </w:r>
-    </w:p>
-    <w:p>
-      <w:r>
-        <w:t xml:space="preserve">A variável </w:t>
+        <w:t xml:space="preserve">, que é a base analítica enriquecida pela via em lote.</w:t>
+      </w:r>
+    </w:p>
+    <w:p>
+      <w:r>
+        <w:t xml:space="preserve">A filtragem dos dados é feita </w:t>
       </w:r>
       <w:r>
         <w:rPr>
           <w:b/>
           <w:bCs/>
         </w:rPr>
-        <w:t xml:space="preserve">Pais</w:t>
-      </w:r>
-      <w:r>
-        <w:t xml:space="preserve"> obtém os países disponíveis na tabela, por ordem alfabética, ignorando valores nulos:</w:t>
-      </w:r>
-    </w:p>
-    <w:p>
-      <w:pPr>
-        <w:pStyle w:val="Code"/>
-        <w:keepNext/>
-        <w:keepLines/>
-        <w:shd w:val="clear" w:color="auto" w:fill="F2F2F2"/>
-        <w:spacing w:before="0" w:after="0" w:line="240" w:lineRule="auto"/>
-        <w:ind w:left="284" w:right="284" w:firstLine="0"/>
-        <w:jc w:val="left"/>
-      </w:pPr>
+        <w:t xml:space="preserve">ao nível de cada consulta</w:t>
+      </w:r>
+      <w:r>
+        <w:t xml:space="preserve">, através de cláusulas </w:t>
+      </w:r>
       <w:r>
         <w:rPr>
           <w:rFonts w:ascii="Courier New" w:hAnsi="Courier New" w:cs="Courier New"/>
-          <w:sz w:val="18"/>
-          <w:szCs w:val="18"/>
-        </w:rPr>
-        <w:t xml:space="preserve">SELECT DISTINCT "Pais_Numbeo"</w:t>
-      </w:r>
-    </w:p>
-    <w:p>
-      <w:pPr>
-        <w:pStyle w:val="Code"/>
-        <w:keepNext/>
-        <w:keepLines/>
-        <w:shd w:val="clear" w:color="auto" w:fill="F2F2F2"/>
-        <w:spacing w:before="0" w:after="0" w:line="240" w:lineRule="auto"/>
-        <w:ind w:left="284" w:right="284" w:firstLine="0"/>
-        <w:jc w:val="left"/>
-      </w:pPr>
+          <w:sz w:val="21"/>
+          <w:szCs w:val="21"/>
+        </w:rPr>
+        <w:t xml:space="preserve">WHERE</w:t>
+      </w:r>
+      <w:r>
+        <w:t xml:space="preserve"> e </w:t>
+      </w:r>
       <w:r>
         <w:rPr>
           <w:rFonts w:ascii="Courier New" w:hAnsi="Courier New" w:cs="Courier New"/>
-          <w:sz w:val="18"/>
-          <w:szCs w:val="18"/>
-        </w:rPr>
-        <w:t xml:space="preserve">FROM ofertas_emprego</w:t>
-      </w:r>
-    </w:p>
-    <w:p>
-      <w:pPr>
-        <w:pStyle w:val="Code"/>
-        <w:keepNext/>
-        <w:keepLines/>
-        <w:shd w:val="clear" w:color="auto" w:fill="F2F2F2"/>
-        <w:spacing w:before="0" w:after="0" w:line="240" w:lineRule="auto"/>
-        <w:ind w:left="284" w:right="284" w:firstLine="0"/>
-        <w:jc w:val="left"/>
-      </w:pPr>
-      <w:r>
-        <w:rPr>
-          <w:rFonts w:ascii="Courier New" w:hAnsi="Courier New" w:cs="Courier New"/>
-          <w:sz w:val="18"/>
-          <w:szCs w:val="18"/>
-        </w:rPr>
-        <w:t xml:space="preserve">WHERE "Pais_Numbeo" IS NOT NULL</w:t>
-      </w:r>
-    </w:p>
-    <w:p>
-      <w:pPr>
-        <w:pStyle w:val="Code"/>
-        <w:keepLines/>
-        <w:shd w:val="clear" w:color="auto" w:fill="F2F2F2"/>
-        <w:spacing w:before="0" w:after="160" w:line="240" w:lineRule="auto"/>
-        <w:ind w:left="284" w:right="284" w:firstLine="0"/>
-        <w:jc w:val="left"/>
-      </w:pPr>
-      <w:r>
-        <w:rPr>
-          <w:rFonts w:ascii="Courier New" w:hAnsi="Courier New" w:cs="Courier New"/>
-          <w:sz w:val="18"/>
-          <w:szCs w:val="18"/>
-        </w:rPr>
-        <w:t xml:space="preserve">ORDER BY "Pais_Numbeo" ASC;</w:t>
-      </w:r>
-    </w:p>
-    <w:p>
-      <w:r>
-        <w:t xml:space="preserve">A consulta devolve dez mercados: </w:t>
+          <w:sz w:val="21"/>
+          <w:szCs w:val="21"/>
+        </w:rPr>
+        <w:t xml:space="preserve">GROUP BY</w:t>
+      </w:r>
+      <w:r>
+        <w:t xml:space="preserve"> escritas diretamente em SQL, e não através de variáveis de </w:t>
       </w:r>
       <w:r>
         <w:rPr>
           <w:i/>
           <w:iCs/>
         </w:rPr>
-        <w:t xml:space="preserve">Australia</w:t>
-      </w:r>
-      <w:r>
-        <w:t xml:space="preserve">, </w:t>
+        <w:t xml:space="preserve">dashboard</w:t>
+      </w:r>
+      <w:r>
+        <w:t xml:space="preserve">. Esta opção mantém cada painel autónomo e legível, mas implica que o utilizador não possa restringir interativamente o conjunto de países ou de níveis de experiência apresentados. A introdução de variáveis do tipo </w:t>
       </w:r>
       <w:r>
         <w:rPr>
           <w:i/>
           <w:iCs/>
         </w:rPr>
-        <w:t xml:space="preserve">Canada</w:t>
-      </w:r>
-      <w:r>
-        <w:t xml:space="preserve">, </w:t>
-      </w:r>
-      <w:r>
-        <w:rPr>
-          <w:i/>
-          <w:iCs/>
-        </w:rPr>
-        <w:t xml:space="preserve">France</w:t>
-      </w:r>
-      <w:r>
-        <w:t xml:space="preserve">, </w:t>
-      </w:r>
-      <w:r>
-        <w:rPr>
-          <w:i/>
-          <w:iCs/>
-        </w:rPr>
-        <w:t xml:space="preserve">Germany</w:t>
-      </w:r>
-      <w:r>
-        <w:t xml:space="preserve">, </w:t>
-      </w:r>
-      <w:r>
-        <w:rPr>
-          <w:i/>
-          <w:iCs/>
-        </w:rPr>
-        <w:t xml:space="preserve">India</w:t>
-      </w:r>
-      <w:r>
-        <w:t xml:space="preserve">, </w:t>
-      </w:r>
-      <w:r>
-        <w:rPr>
-          <w:i/>
-          <w:iCs/>
-        </w:rPr>
-        <w:t xml:space="preserve">Japan</w:t>
-      </w:r>
-      <w:r>
-        <w:t xml:space="preserve">, </w:t>
-      </w:r>
-      <w:r>
-        <w:rPr>
-          <w:i/>
-          <w:iCs/>
-        </w:rPr>
-        <w:t xml:space="preserve">Netherlands</w:t>
-      </w:r>
-      <w:r>
-        <w:t xml:space="preserve">, </w:t>
-      </w:r>
-      <w:r>
-        <w:rPr>
-          <w:i/>
-          <w:iCs/>
-        </w:rPr>
-        <w:t xml:space="preserve">Singapore</w:t>
-      </w:r>
-      <w:r>
-        <w:t xml:space="preserve">, </w:t>
-      </w:r>
-      <w:r>
-        <w:rPr>
-          <w:i/>
-          <w:iCs/>
-        </w:rPr>
-        <w:t xml:space="preserve">United Kingdom</w:t>
-      </w:r>
-      <w:r>
-        <w:t xml:space="preserve"> e </w:t>
-      </w:r>
-      <w:r>
-        <w:rPr>
-          <w:i/>
-          <w:iCs/>
-        </w:rPr>
-        <w:t xml:space="preserve">United States</w:t>
+        <w:t xml:space="preserve">Query</w:t>
+      </w:r>
+      <w:r>
+        <w:t xml:space="preserve">, que permitiriam essa filtragem transversal, é apontada como trabalho futuro na secção </w:t>
+      </w:r>
+      <w:r>
+        <w:t xml:space="preserve">7.2</w:t>
       </w:r>
       <w:r>
         <w:t xml:space="preserve">.</w:t>
-      </w:r>
-    </w:p>
-    <w:p>
-      <w:r>
-        <w:t xml:space="preserve">A variável </w:t>
-      </w:r>
-      <w:r>
-        <w:rPr>
-          <w:b/>
-          <w:bCs/>
-        </w:rPr>
-        <w:t xml:space="preserve">Nivel_Experiencia</w:t>
-      </w:r>
-      <w:r>
-        <w:t xml:space="preserve"> obtém, do mesmo modo, os níveis de experiência existentes, devolvendo os três valores padronizados pelos nós Rule Engine do KNIME: </w:t>
-      </w:r>
-      <w:r>
-        <w:rPr>
-          <w:i/>
-          <w:iCs/>
-        </w:rPr>
-        <w:t xml:space="preserve">Entry</w:t>
-      </w:r>
-      <w:r>
-        <w:t xml:space="preserve">, </w:t>
-      </w:r>
-      <w:r>
-        <w:rPr>
-          <w:i/>
-          <w:iCs/>
-        </w:rPr>
-        <w:t xml:space="preserve">Mid</w:t>
-      </w:r>
-      <w:r>
-        <w:t xml:space="preserve"> e </w:t>
-      </w:r>
-      <w:r>
-        <w:rPr>
-          <w:i/>
-          <w:iCs/>
-        </w:rPr>
-        <w:t xml:space="preserve">Senior</w:t>
-      </w:r>
-      <w:r>
-        <w:t xml:space="preserve">.</w:t>
-      </w:r>
-    </w:p>
-    <w:p>
-      <w:pPr>
-        <w:pStyle w:val="Code"/>
-        <w:keepNext/>
-        <w:keepLines/>
-        <w:shd w:val="clear" w:color="auto" w:fill="F2F2F2"/>
-        <w:spacing w:before="0" w:after="0" w:line="240" w:lineRule="auto"/>
-        <w:ind w:left="284" w:right="284" w:firstLine="0"/>
-        <w:jc w:val="left"/>
-      </w:pPr>
-      <w:r>
-        <w:rPr>
-          <w:rFonts w:ascii="Courier New" w:hAnsi="Courier New" w:cs="Courier New"/>
-          <w:sz w:val="18"/>
-          <w:szCs w:val="18"/>
-        </w:rPr>
-        <w:t xml:space="preserve">SELECT DISTINCT "Nivel_Experiencia"</w:t>
-      </w:r>
-    </w:p>
-    <w:p>
-      <w:pPr>
-        <w:pStyle w:val="Code"/>
-        <w:keepNext/>
-        <w:keepLines/>
-        <w:shd w:val="clear" w:color="auto" w:fill="F2F2F2"/>
-        <w:spacing w:before="0" w:after="0" w:line="240" w:lineRule="auto"/>
-        <w:ind w:left="284" w:right="284" w:firstLine="0"/>
-        <w:jc w:val="left"/>
-      </w:pPr>
-      <w:r>
-        <w:rPr>
-          <w:rFonts w:ascii="Courier New" w:hAnsi="Courier New" w:cs="Courier New"/>
-          <w:sz w:val="18"/>
-          <w:szCs w:val="18"/>
-        </w:rPr>
-        <w:t xml:space="preserve">FROM ofertas_emprego</w:t>
-      </w:r>
-    </w:p>
-    <w:p>
-      <w:pPr>
-        <w:pStyle w:val="Code"/>
-        <w:keepNext/>
-        <w:keepLines/>
-        <w:shd w:val="clear" w:color="auto" w:fill="F2F2F2"/>
-        <w:spacing w:before="0" w:after="0" w:line="240" w:lineRule="auto"/>
-        <w:ind w:left="284" w:right="284" w:firstLine="0"/>
-        <w:jc w:val="left"/>
-      </w:pPr>
-      <w:r>
-        <w:rPr>
-          <w:rFonts w:ascii="Courier New" w:hAnsi="Courier New" w:cs="Courier New"/>
-          <w:sz w:val="18"/>
-          <w:szCs w:val="18"/>
-        </w:rPr>
-        <w:t xml:space="preserve">WHERE "Nivel_Experiencia" IS NOT NULL</w:t>
-      </w:r>
-    </w:p>
-    <w:p>
-      <w:pPr>
-        <w:pStyle w:val="Code"/>
-        <w:keepLines/>
-        <w:shd w:val="clear" w:color="auto" w:fill="F2F2F2"/>
-        <w:spacing w:before="0" w:after="160" w:line="240" w:lineRule="auto"/>
-        <w:ind w:left="284" w:right="284" w:firstLine="0"/>
-        <w:jc w:val="left"/>
-      </w:pPr>
-      <w:r>
-        <w:rPr>
-          <w:rFonts w:ascii="Courier New" w:hAnsi="Courier New" w:cs="Courier New"/>
-          <w:sz w:val="18"/>
-          <w:szCs w:val="18"/>
-        </w:rPr>
-        <w:t xml:space="preserve">ORDER BY "Nivel_Experiencia" ASC;</w:t>
       </w:r>
     </w:p>
     <w:p>
@@ -19847,44 +19596,17 @@
         <w:fldChar w:fldCharType="end"/>
       </w:r>
       <w:r>
-        <w:t xml:space="preserve">, é composto por quatro painéis. Todos partilham a mesma cláusula de filtragem, que utiliza as variáveis descritas na secção anterior e faz com que as consultas se adaptem dinamicamente às seleções do utilizador:</w:t>
-      </w:r>
-    </w:p>
-    <w:p>
-      <w:pPr>
-        <w:pStyle w:val="Code"/>
-        <w:keepNext/>
-        <w:keepLines/>
-        <w:shd w:val="clear" w:color="auto" w:fill="F2F2F2"/>
-        <w:spacing w:before="0" w:after="0" w:line="240" w:lineRule="auto"/>
-        <w:ind w:left="284" w:right="284" w:firstLine="0"/>
-        <w:jc w:val="left"/>
-      </w:pPr>
-      <w:r>
-        <w:rPr>
-          <w:rFonts w:ascii="Courier New" w:hAnsi="Courier New" w:cs="Courier New"/>
-          <w:sz w:val="18"/>
-          <w:szCs w:val="18"/>
-        </w:rPr>
-        <w:t xml:space="preserve">WHERE "Pais_Numbeo" IN ($Pais)</w:t>
-      </w:r>
-    </w:p>
-    <w:p>
-      <w:pPr>
-        <w:pStyle w:val="Code"/>
-        <w:keepLines/>
-        <w:shd w:val="clear" w:color="auto" w:fill="F2F2F2"/>
-        <w:spacing w:before="0" w:after="160" w:line="240" w:lineRule="auto"/>
-        <w:ind w:left="284" w:right="284" w:firstLine="0"/>
-        <w:jc w:val="left"/>
-      </w:pPr>
-      <w:r>
-        <w:rPr>
-          <w:rFonts w:ascii="Courier New" w:hAnsi="Courier New" w:cs="Courier New"/>
-          <w:sz w:val="18"/>
-          <w:szCs w:val="18"/>
-        </w:rPr>
-        <w:t xml:space="preserve">  AND "Nivel_Experiencia" IN ($Nivel_Experiencia)</w:t>
+        <w:t xml:space="preserve">, é composto por quatro painéis, dispostos numa grelha de dois por dois. Cada painel tem a sua própria consulta, agrupada por país e, num dos casos, também por nível de experiência. As consultas apresentadas nas subsecções seguintes são as efetivamente utilizadas, exportadas do </w:t>
+      </w:r>
+      <w:r>
+        <w:rPr>
+          <w:i/>
+          <w:iCs/>
+        </w:rPr>
+        <w:t xml:space="preserve">dashboard</w:t>
+      </w:r>
+      <w:r>
+        <w:t xml:space="preserve">.</w:t>
       </w:r>
     </w:p>
     <w:p>
@@ -19975,11 +19697,6 @@
       <w:bookmarkEnd w:id="195"/>
     </w:p>
     <w:p>
-      <w:r>
-        <w:t xml:space="preserve">As consultas apresentadas nas subsecções seguintes correspondem à forma representativa de cada painel.</w:t>
-      </w:r>
-    </w:p>
-    <w:p>
       <w:pPr>
         <w:pStyle w:val="Cabealho3"/>
         <w:keepNext/>
@@ -20022,7 +19739,7 @@
         <w:fldChar w:fldCharType="end"/>
       </w:r>
       <w:r>
-        <w:t xml:space="preserve">, é a seguinte:</w:t>
+        <w:t xml:space="preserve">, descarta os registos sem poupança calculada:</w:t>
       </w:r>
     </w:p>
     <w:p>
@@ -20214,7 +19931,7 @@
           <w:sz w:val="18"/>
           <w:szCs w:val="18"/>
         </w:rPr>
-        <w:t xml:space="preserve">SELECT "Pais_Numbeo" AS "País",</w:t>
+        <w:t xml:space="preserve">SELECT</w:t>
       </w:r>
     </w:p>
     <w:p>
@@ -20233,7 +19950,7 @@
           <w:sz w:val="18"/>
           <w:szCs w:val="18"/>
         </w:rPr>
-        <w:t xml:space="preserve">       AVG("Salario_Euros") AS "Salário Médio Anual (€)"</w:t>
+        <w:t xml:space="preserve">  "Pais_Numbeo" as "País",</w:t>
       </w:r>
     </w:p>
     <w:p>
@@ -20252,7 +19969,7 @@
           <w:sz w:val="18"/>
           <w:szCs w:val="18"/>
         </w:rPr>
-        <w:t xml:space="preserve">FROM ofertas_emprego</w:t>
+        <w:t xml:space="preserve">  ROUND(AVG("Salario_Euros")::numeric, 2) as "Salário Médio (€)"</w:t>
       </w:r>
     </w:p>
     <w:p>
@@ -20271,7 +19988,7 @@
           <w:sz w:val="18"/>
           <w:szCs w:val="18"/>
         </w:rPr>
-        <w:t xml:space="preserve">WHERE "Pais_Numbeo" IN ($Pais)</w:t>
+        <w:t xml:space="preserve">FROM ofertas_emprego</w:t>
       </w:r>
     </w:p>
     <w:p>
@@ -20290,91 +20007,7 @@
           <w:sz w:val="18"/>
           <w:szCs w:val="18"/>
         </w:rPr>
-        <w:t xml:space="preserve">  AND "Nivel_Experiencia" IN ($Nivel_Experiencia)</w:t>
-      </w:r>
-    </w:p>
-    <w:p>
-      <w:pPr>
-        <w:pStyle w:val="Code"/>
-        <w:keepLines/>
-        <w:shd w:val="clear" w:color="auto" w:fill="F2F2F2"/>
-        <w:spacing w:before="0" w:after="160" w:line="240" w:lineRule="auto"/>
-        <w:ind w:left="284" w:right="284" w:firstLine="0"/>
-        <w:jc w:val="left"/>
-      </w:pPr>
-      <w:r>
-        <w:rPr>
-          <w:rFonts w:ascii="Courier New" w:hAnsi="Courier New" w:cs="Courier New"/>
-          <w:sz w:val="18"/>
-          <w:szCs w:val="18"/>
-        </w:rPr>
-        <w:t xml:space="preserve">GROUP BY "Pais_Numbeo";</w:t>
-      </w:r>
-    </w:p>
-    <w:p>
-      <w:r>
-        <w:t xml:space="preserve">Os Estados Unidos (14 %) e Singapura (13 %) apresentam as maiores fatias, seguidos da Austrália (12 %). Os restantes mercados situam-se entre 7 % e 11 %, com exceção da Índia, que ocupa a menor fatia. Este painel, lido em conjunto com o anterior, reforça a ideia central do trabalho: o salário bruto mais elevado não corresponde necessariamente à maior capacidade de poupança.</w:t>
-      </w:r>
-    </w:p>
-    <w:p>
-      <w:pPr>
-        <w:pStyle w:val="Cabealho3"/>
-        <w:keepNext/>
-        <w:spacing w:before="200" w:after="100"/>
-      </w:pPr>
-      <w:bookmarkStart w:id="199" w:name="_Toc_p3"/>
-      <w:r>
-        <w:t xml:space="preserve">Salários por País e Senioridade</w:t>
-      </w:r>
-      <w:bookmarkEnd w:id="199"/>
-    </w:p>
-    <w:p>
-      <w:r>
-        <w:t xml:space="preserve">O gráfico de barras agrupadas compara, para cada mercado, quatro indicadores: o total de vagas, o salário mínimo, o salário médio e o salário máximo. A consulta combina funções de agregação (</w:t>
-      </w:r>
-      <w:r>
-        <w:rPr>
-          <w:rFonts w:ascii="Courier New" w:hAnsi="Courier New" w:cs="Courier New"/>
-          <w:sz w:val="21"/>
-          <w:szCs w:val="21"/>
-        </w:rPr>
-        <w:t xml:space="preserve">COUNT</w:t>
-      </w:r>
-      <w:r>
-        <w:t xml:space="preserve">, </w:t>
-      </w:r>
-      <w:r>
-        <w:rPr>
-          <w:rFonts w:ascii="Courier New" w:hAnsi="Courier New" w:cs="Courier New"/>
-          <w:sz w:val="21"/>
-          <w:szCs w:val="21"/>
-        </w:rPr>
-        <w:t xml:space="preserve">MIN</w:t>
-      </w:r>
-      <w:r>
-        <w:t xml:space="preserve">, </w:t>
-      </w:r>
-      <w:r>
-        <w:rPr>
-          <w:rFonts w:ascii="Courier New" w:hAnsi="Courier New" w:cs="Courier New"/>
-          <w:sz w:val="21"/>
-          <w:szCs w:val="21"/>
-        </w:rPr>
-        <w:t xml:space="preserve">AVG</w:t>
-      </w:r>
-      <w:r>
-        <w:t xml:space="preserve"> e </w:t>
-      </w:r>
-      <w:r>
-        <w:rPr>
-          <w:rFonts w:ascii="Courier New" w:hAnsi="Courier New" w:cs="Courier New"/>
-          <w:sz w:val="21"/>
-          <w:szCs w:val="21"/>
-        </w:rPr>
-        <w:t xml:space="preserve">MAX</w:t>
-      </w:r>
-      <w:r>
-        <w:t xml:space="preserve">):</w:t>
+        <w:t xml:space="preserve">WHERE "Salario_Euros" &gt; 0</w:t>
       </w:r>
     </w:p>
     <w:p>
@@ -20393,7 +20026,101 @@
           <w:sz w:val="18"/>
           <w:szCs w:val="18"/>
         </w:rPr>
-        <w:t xml:space="preserve">SELECT "Pais_Numbeo" AS "País",</w:t>
+        <w:t xml:space="preserve">GROUP BY "Pais_Numbeo"</w:t>
+      </w:r>
+    </w:p>
+    <w:p>
+      <w:pPr>
+        <w:pStyle w:val="Code"/>
+        <w:keepLines/>
+        <w:shd w:val="clear" w:color="auto" w:fill="F2F2F2"/>
+        <w:spacing w:before="0" w:after="160" w:line="240" w:lineRule="auto"/>
+        <w:ind w:left="284" w:right="284" w:firstLine="0"/>
+        <w:jc w:val="left"/>
+      </w:pPr>
+      <w:r>
+        <w:rPr>
+          <w:rFonts w:ascii="Courier New" w:hAnsi="Courier New" w:cs="Courier New"/>
+          <w:sz w:val="18"/>
+          <w:szCs w:val="18"/>
+        </w:rPr>
+        <w:t xml:space="preserve">ORDER BY "Salário Médio (€)" DESC;</w:t>
+      </w:r>
+    </w:p>
+    <w:p>
+      <w:r>
+        <w:t xml:space="preserve">Os Estados Unidos (14 %) e Singapura (13 %) apresentam as maiores fatias, seguidos da Austrália (12 %). Os restantes mercados situam-se entre 7 % e 11 %, com exceção da Índia, que ocupa a menor fatia. Este painel, lido em conjunto com o anterior, reforça a ideia central do trabalho: o salário bruto mais elevado não corresponde necessariamente à maior capacidade de poupança.</w:t>
+      </w:r>
+    </w:p>
+    <w:p>
+      <w:pPr>
+        <w:pStyle w:val="Cabealho3"/>
+        <w:keepNext/>
+        <w:spacing w:before="200" w:after="100"/>
+      </w:pPr>
+      <w:bookmarkStart w:id="199" w:name="_Toc_p3"/>
+      <w:r>
+        <w:t xml:space="preserve">Salários por País e Senioridade</w:t>
+      </w:r>
+      <w:bookmarkEnd w:id="199"/>
+    </w:p>
+    <w:p>
+      <w:r>
+        <w:t xml:space="preserve">O gráfico de barras agrupadas compara quatro indicadores — total de vagas, salário mínimo, médio e máximo — combinando as funções de agregação </w:t>
+      </w:r>
+      <w:r>
+        <w:rPr>
+          <w:rFonts w:ascii="Courier New" w:hAnsi="Courier New" w:cs="Courier New"/>
+          <w:sz w:val="21"/>
+          <w:szCs w:val="21"/>
+        </w:rPr>
+        <w:t xml:space="preserve">COUNT</w:t>
+      </w:r>
+      <w:r>
+        <w:t xml:space="preserve">, </w:t>
+      </w:r>
+      <w:r>
+        <w:rPr>
+          <w:rFonts w:ascii="Courier New" w:hAnsi="Courier New" w:cs="Courier New"/>
+          <w:sz w:val="21"/>
+          <w:szCs w:val="21"/>
+        </w:rPr>
+        <w:t xml:space="preserve">MIN</w:t>
+      </w:r>
+      <w:r>
+        <w:t xml:space="preserve">, </w:t>
+      </w:r>
+      <w:r>
+        <w:rPr>
+          <w:rFonts w:ascii="Courier New" w:hAnsi="Courier New" w:cs="Courier New"/>
+          <w:sz w:val="21"/>
+          <w:szCs w:val="21"/>
+        </w:rPr>
+        <w:t xml:space="preserve">AVG</w:t>
+      </w:r>
+      <w:r>
+        <w:t xml:space="preserve"> e </w:t>
+      </w:r>
+      <w:r>
+        <w:rPr>
+          <w:rFonts w:ascii="Courier New" w:hAnsi="Courier New" w:cs="Courier New"/>
+          <w:sz w:val="21"/>
+          <w:szCs w:val="21"/>
+        </w:rPr>
+        <w:t xml:space="preserve">MAX</w:t>
+      </w:r>
+      <w:r>
+        <w:t xml:space="preserve">. Ao contrário dos restantes painéis, o agrupamento é </w:t>
+      </w:r>
+      <w:r>
+        <w:rPr>
+          <w:b/>
+          <w:bCs/>
+        </w:rPr>
+        <w:t xml:space="preserve">duplo</w:t>
+      </w:r>
+      <w:r>
+        <w:t xml:space="preserve">, por país e por nível de experiência, pelo que cada mercado surge no eixo tantas vezes quantos os níveis para os quais existem ofertas:</w:t>
       </w:r>
     </w:p>
     <w:p>
@@ -20412,7 +20139,7 @@
           <w:sz w:val="18"/>
           <w:szCs w:val="18"/>
         </w:rPr>
-        <w:t xml:space="preserve">       COUNT(*)              AS "Total de Vagas",</w:t>
+        <w:t xml:space="preserve">SELECT</w:t>
       </w:r>
     </w:p>
     <w:p>
@@ -20431,7 +20158,7 @@
           <w:sz w:val="18"/>
           <w:szCs w:val="18"/>
         </w:rPr>
-        <w:t xml:space="preserve">       MIN("Salario_Euros")  AS "Salário Mínimo (€)",</w:t>
+        <w:t xml:space="preserve">  "Pais_Numbeo" as "País",</w:t>
       </w:r>
     </w:p>
     <w:p>
@@ -20450,7 +20177,7 @@
           <w:sz w:val="18"/>
           <w:szCs w:val="18"/>
         </w:rPr>
-        <w:t xml:space="preserve">       AVG("Salario_Euros")  AS "Salário Médio (€)",</w:t>
+        <w:t xml:space="preserve">  "Nivel_Experiencia" as "Senioridade",</w:t>
       </w:r>
     </w:p>
     <w:p>
@@ -20469,7 +20196,7 @@
           <w:sz w:val="18"/>
           <w:szCs w:val="18"/>
         </w:rPr>
-        <w:t xml:space="preserve">       MAX("Salario_Euros")  AS "Salário Máximo (€)"</w:t>
+        <w:t xml:space="preserve">  COUNT("Titulo_Vaga") as "Total de Vagas",</w:t>
       </w:r>
     </w:p>
     <w:p>
@@ -20488,7 +20215,7 @@
           <w:sz w:val="18"/>
           <w:szCs w:val="18"/>
         </w:rPr>
-        <w:t xml:space="preserve">FROM ofertas_emprego</w:t>
+        <w:t xml:space="preserve">  ROUND(MIN("Salario_Euros")::numeric, 0) as "Salário Mínimo (€)",</w:t>
       </w:r>
     </w:p>
     <w:p>
@@ -20507,7 +20234,7 @@
           <w:sz w:val="18"/>
           <w:szCs w:val="18"/>
         </w:rPr>
-        <w:t xml:space="preserve">WHERE "Pais_Numbeo" IN ($Pais)</w:t>
+        <w:t xml:space="preserve">  ROUND(AVG("Salario_Euros")::numeric, 0) as "Salário Médio (€)",</w:t>
       </w:r>
     </w:p>
     <w:p>
@@ -20526,7 +20253,64 @@
           <w:sz w:val="18"/>
           <w:szCs w:val="18"/>
         </w:rPr>
-        <w:t xml:space="preserve">  AND "Nivel_Experiencia" IN ($Nivel_Experiencia)</w:t>
+        <w:t xml:space="preserve">  ROUND(MAX("Salario_Euros")::numeric, 0) as "Salário Máximo (€)"</w:t>
+      </w:r>
+    </w:p>
+    <w:p>
+      <w:pPr>
+        <w:pStyle w:val="Code"/>
+        <w:keepNext/>
+        <w:keepLines/>
+        <w:shd w:val="clear" w:color="auto" w:fill="F2F2F2"/>
+        <w:spacing w:before="0" w:after="0" w:line="240" w:lineRule="auto"/>
+        <w:ind w:left="284" w:right="284" w:firstLine="0"/>
+        <w:jc w:val="left"/>
+      </w:pPr>
+      <w:r>
+        <w:rPr>
+          <w:rFonts w:ascii="Courier New" w:hAnsi="Courier New" w:cs="Courier New"/>
+          <w:sz w:val="18"/>
+          <w:szCs w:val="18"/>
+        </w:rPr>
+        <w:t xml:space="preserve">FROM ofertas_emprego</w:t>
+      </w:r>
+    </w:p>
+    <w:p>
+      <w:pPr>
+        <w:pStyle w:val="Code"/>
+        <w:keepNext/>
+        <w:keepLines/>
+        <w:shd w:val="clear" w:color="auto" w:fill="F2F2F2"/>
+        <w:spacing w:before="0" w:after="0" w:line="240" w:lineRule="auto"/>
+        <w:ind w:left="284" w:right="284" w:firstLine="0"/>
+        <w:jc w:val="left"/>
+      </w:pPr>
+      <w:r>
+        <w:rPr>
+          <w:rFonts w:ascii="Courier New" w:hAnsi="Courier New" w:cs="Courier New"/>
+          <w:sz w:val="18"/>
+          <w:szCs w:val="18"/>
+        </w:rPr>
+        <w:t xml:space="preserve">WHERE "Salario_Euros" &gt; 0</w:t>
+      </w:r>
+    </w:p>
+    <w:p>
+      <w:pPr>
+        <w:pStyle w:val="Code"/>
+        <w:keepNext/>
+        <w:keepLines/>
+        <w:shd w:val="clear" w:color="auto" w:fill="F2F2F2"/>
+        <w:spacing w:before="0" w:after="0" w:line="240" w:lineRule="auto"/>
+        <w:ind w:left="284" w:right="284" w:firstLine="0"/>
+        <w:jc w:val="left"/>
+      </w:pPr>
+      <w:r>
+        <w:rPr>
+          <w:rFonts w:ascii="Courier New" w:hAnsi="Courier New" w:cs="Courier New"/>
+          <w:sz w:val="18"/>
+          <w:szCs w:val="18"/>
+        </w:rPr>
+        <w:t xml:space="preserve">GROUP BY "Pais_Numbeo", "Nivel_Experiencia"</w:t>
       </w:r>
     </w:p>
     <w:p>
@@ -20544,22 +20328,12 @@
           <w:sz w:val="18"/>
           <w:szCs w:val="18"/>
         </w:rPr>
-        <w:t xml:space="preserve">GROUP BY "Pais_Numbeo";</w:t>
-      </w:r>
-    </w:p>
-    <w:p>
-      <w:r>
-        <w:t xml:space="preserve">O salário médio e, sobretudo, o salário máximo são mais elevados nos Estados Unidos e em Singapura, seguidos da Austrália e do Canadá, enquanto a Índia se encontra entre os valores mais baixos. A amplitude entre o salário mínimo e o máximo é muito grande em todos os mercados, o que justifica a possibilidade de filtrar os resultados por nível de experiência através da variável </w:t>
-      </w:r>
-      <w:r>
-        <w:rPr>
-          <w:i/>
-          <w:iCs/>
-        </w:rPr>
-        <w:t xml:space="preserve">Nivel_Experiencia</w:t>
-      </w:r>
-      <w:r>
-        <w:t xml:space="preserve">.</w:t>
+        <w:t xml:space="preserve">ORDER BY "Salário Médio (€)" DESC;</w:t>
+      </w:r>
+    </w:p>
+    <w:p>
+      <w:r>
+        <w:t xml:space="preserve">O salário médio e, sobretudo, o salário máximo são mais elevados nos Estados Unidos e em Singapura, seguidos da Austrália e do Canadá, enquanto a Índia se encontra entre os valores mais baixos. A amplitude entre o salário mínimo e o máximo é muito grande em todos os mercados, o que justifica a separação por nível de experiência neste painel.</w:t>
       </w:r>
     </w:p>
     <w:p>
@@ -20586,36 +20360,138 @@
         <w:t xml:space="preserve">gauges</w:t>
       </w:r>
       <w:r>
-        <w:t xml:space="preserve">) apresenta a contagem absoluta de ofertas por mercado, obtida com </w:t>
-      </w:r>
+        <w:t xml:space="preserve">) apresenta a contagem absoluta de ofertas por mercado, obtida com a consulta seguinte. Os valores observados encontram-se na </w:t>
+      </w:r>
+      <w:r>
+        <w:fldChar w:fldCharType="begin"/>
+      </w:r>
+      <w:r>
+        <w:instrText xml:space="preserve"> REF _RefTab_vagas \h </w:instrText>
+      </w:r>
+      <w:r>
+        <w:fldChar w:fldCharType="separate"/>
+      </w:r>
+      <w:r>
+        <w:t xml:space="preserve">Tabela 10</w:t>
+      </w:r>
+      <w:r>
+        <w:fldChar w:fldCharType="end"/>
+      </w:r>
+      <w:r>
+        <w:t xml:space="preserve">.</w:t>
+      </w:r>
+    </w:p>
+    <w:p>
+      <w:pPr>
+        <w:pStyle w:val="Code"/>
+        <w:keepNext/>
+        <w:keepLines/>
+        <w:shd w:val="clear" w:color="auto" w:fill="F2F2F2"/>
+        <w:spacing w:before="0" w:after="0" w:line="240" w:lineRule="auto"/>
+        <w:ind w:left="284" w:right="284" w:firstLine="0"/>
+        <w:jc w:val="left"/>
+      </w:pPr>
       <w:r>
         <w:rPr>
           <w:rFonts w:ascii="Courier New" w:hAnsi="Courier New" w:cs="Courier New"/>
-          <w:sz w:val="21"/>
-          <w:szCs w:val="21"/>
-        </w:rPr>
-        <w:t xml:space="preserve">COUNT(*)</w:t>
-      </w:r>
-      <w:r>
-        <w:t xml:space="preserve"> agrupado por país. Os valores observados encontram-se na </w:t>
-      </w:r>
-      <w:r>
-        <w:fldChar w:fldCharType="begin"/>
-      </w:r>
-      <w:r>
-        <w:instrText xml:space="preserve"> REF _RefTab_vagas \h </w:instrText>
-      </w:r>
-      <w:r>
-        <w:fldChar w:fldCharType="separate"/>
-      </w:r>
-      <w:r>
-        <w:t xml:space="preserve">Tabela 10</w:t>
-      </w:r>
-      <w:r>
-        <w:fldChar w:fldCharType="end"/>
-      </w:r>
-      <w:r>
-        <w:t xml:space="preserve">.</w:t>
+          <w:sz w:val="18"/>
+          <w:szCs w:val="18"/>
+        </w:rPr>
+        <w:t xml:space="preserve">SELECT</w:t>
+      </w:r>
+    </w:p>
+    <w:p>
+      <w:pPr>
+        <w:pStyle w:val="Code"/>
+        <w:keepNext/>
+        <w:keepLines/>
+        <w:shd w:val="clear" w:color="auto" w:fill="F2F2F2"/>
+        <w:spacing w:before="0" w:after="0" w:line="240" w:lineRule="auto"/>
+        <w:ind w:left="284" w:right="284" w:firstLine="0"/>
+        <w:jc w:val="left"/>
+      </w:pPr>
+      <w:r>
+        <w:rPr>
+          <w:rFonts w:ascii="Courier New" w:hAnsi="Courier New" w:cs="Courier New"/>
+          <w:sz w:val="18"/>
+          <w:szCs w:val="18"/>
+        </w:rPr>
+        <w:t xml:space="preserve">  "Pais_Numbeo" as "País",</w:t>
+      </w:r>
+    </w:p>
+    <w:p>
+      <w:pPr>
+        <w:pStyle w:val="Code"/>
+        <w:keepNext/>
+        <w:keepLines/>
+        <w:shd w:val="clear" w:color="auto" w:fill="F2F2F2"/>
+        <w:spacing w:before="0" w:after="0" w:line="240" w:lineRule="auto"/>
+        <w:ind w:left="284" w:right="284" w:firstLine="0"/>
+        <w:jc w:val="left"/>
+      </w:pPr>
+      <w:r>
+        <w:rPr>
+          <w:rFonts w:ascii="Courier New" w:hAnsi="Courier New" w:cs="Courier New"/>
+          <w:sz w:val="18"/>
+          <w:szCs w:val="18"/>
+        </w:rPr>
+        <w:t xml:space="preserve">  COUNT("Titulo_Vaga") as "Total de Vagas"</w:t>
+      </w:r>
+    </w:p>
+    <w:p>
+      <w:pPr>
+        <w:pStyle w:val="Code"/>
+        <w:keepNext/>
+        <w:keepLines/>
+        <w:shd w:val="clear" w:color="auto" w:fill="F2F2F2"/>
+        <w:spacing w:before="0" w:after="0" w:line="240" w:lineRule="auto"/>
+        <w:ind w:left="284" w:right="284" w:firstLine="0"/>
+        <w:jc w:val="left"/>
+      </w:pPr>
+      <w:r>
+        <w:rPr>
+          <w:rFonts w:ascii="Courier New" w:hAnsi="Courier New" w:cs="Courier New"/>
+          <w:sz w:val="18"/>
+          <w:szCs w:val="18"/>
+        </w:rPr>
+        <w:t xml:space="preserve">FROM ofertas_emprego</w:t>
+      </w:r>
+    </w:p>
+    <w:p>
+      <w:pPr>
+        <w:pStyle w:val="Code"/>
+        <w:keepNext/>
+        <w:keepLines/>
+        <w:shd w:val="clear" w:color="auto" w:fill="F2F2F2"/>
+        <w:spacing w:before="0" w:after="0" w:line="240" w:lineRule="auto"/>
+        <w:ind w:left="284" w:right="284" w:firstLine="0"/>
+        <w:jc w:val="left"/>
+      </w:pPr>
+      <w:r>
+        <w:rPr>
+          <w:rFonts w:ascii="Courier New" w:hAnsi="Courier New" w:cs="Courier New"/>
+          <w:sz w:val="18"/>
+          <w:szCs w:val="18"/>
+        </w:rPr>
+        <w:t xml:space="preserve">GROUP BY "Pais_Numbeo"</w:t>
+      </w:r>
+    </w:p>
+    <w:p>
+      <w:pPr>
+        <w:pStyle w:val="Code"/>
+        <w:keepLines/>
+        <w:shd w:val="clear" w:color="auto" w:fill="F2F2F2"/>
+        <w:spacing w:before="0" w:after="160" w:line="240" w:lineRule="auto"/>
+        <w:ind w:left="284" w:right="284" w:firstLine="0"/>
+        <w:jc w:val="left"/>
+      </w:pPr>
+      <w:r>
+        <w:rPr>
+          <w:rFonts w:ascii="Courier New" w:hAnsi="Courier New" w:cs="Courier New"/>
+          <w:sz w:val="18"/>
+          <w:szCs w:val="18"/>
+        </w:rPr>
+        <w:t xml:space="preserve">ORDER BY "Total de Vagas" DESC;</w:t>
       </w:r>
     </w:p>
     <w:p>
@@ -21630,114 +21506,101 @@
         <w:fldChar w:fldCharType="end"/>
       </w:r>
       <w:r>
-        <w:t xml:space="preserve"> ou do endereço indicado abaixo, o qual consta igualmente do ficheiro </w:t>
-      </w:r>
-      <w:r>
-        <w:rPr>
-          <w:rFonts w:ascii="Courier New" w:hAnsi="Courier New" w:cs="Courier New"/>
-          <w:sz w:val="21"/>
-          <w:szCs w:val="21"/>
-        </w:rPr>
-        <w:t xml:space="preserve">README.md</w:t>
-      </w:r>
-      <w:r>
-        <w:t xml:space="preserve"> entregue com o trabalho.</w:t>
-      </w:r>
-    </w:p>
-    <w:p>
-      <w:pPr>
-        <w:spacing w:before="0" w:after="0" w:line="120" w:lineRule="exact"/>
+        <w:t xml:space="preserve"> ou do endereço indicado abaixo.</w:t>
+      </w:r>
+    </w:p>
+    <w:p>
+      <w:pPr>
+        <w:keepNext/>
+        <w:spacing w:before="120" w:after="0" w:line="240" w:lineRule="auto"/>
         <w:ind w:firstLine="0"/>
-      </w:pPr>
-    </w:p>
-    <w:tbl>
-      <w:tblPr>
-        <w:tblW w:w="3400" w:type="dxa"/>
         <w:jc w:val="center"/>
-        <w:tblBorders>
-          <w:top w:val="dashed" w:sz="8" w:space="0" w:color="7F7F7F"/>
-          <w:left w:val="dashed" w:sz="8" w:space="0" w:color="7F7F7F"/>
-          <w:bottom w:val="dashed" w:sz="8" w:space="0" w:color="7F7F7F"/>
-          <w:right w:val="dashed" w:sz="8" w:space="0" w:color="7F7F7F"/>
-        </w:tblBorders>
-        <w:tblLayout w:type="fixed"/>
-        <w:tblLook w:val="0000"/>
-      </w:tblPr>
-      <w:tblGrid>
-        <w:gridCol w:w="3400"/>
-      </w:tblGrid>
-      <w:tr>
-        <w:trPr>
-          <w:cantSplit/>
-          <w:trHeight w:val="3400" w:hRule="atLeast"/>
-        </w:trPr>
-        <w:tc>
-          <w:tcPr>
-            <w:tcW w:w="3400" w:type="dxa"/>
-            <w:shd w:val="clear" w:color="auto" w:fill="FFF9D6"/>
-            <w:vAlign w:val="center"/>
-          </w:tcPr>
-          <w:p>
-            <w:pPr>
-              <w:spacing w:before="60" w:after="60" w:line="240" w:lineRule="auto"/>
-              <w:ind w:firstLine="0"/>
-              <w:jc w:val="center"/>
-            </w:pPr>
-            <w:r>
-              <w:rPr>
-                <w:i/>
-                <w:iCs/>
-                <w:color w:val="595959"/>
-                <w:sz w:val="20"/>
-                <w:szCs w:val="20"/>
-              </w:rPr>
-              <w:t xml:space="preserve">[ QR Code do vídeo de demonstração ]</w:t>
-            </w:r>
-          </w:p>
-        </w:tc>
-      </w:tr>
-    </w:tbl>
+      </w:pPr>
+      <w:r>
+        <w:rPr>
+          <w:noProof/>
+        </w:rPr>
+        <w:drawing>
+          <wp:inline distT="0" distB="0" distL="0" distR="0">
+            <wp:extent cx="2160000" cy="2160000"/>
+            <wp:effectExtent l="0" t="0" r="0" b="0"/>
+            <wp:docPr id="120" name="Imagem 120" descr="Código QR que remete para o vídeo de demonstração do pipeline, alojado em scanned.page."/>
+            <wp:cNvGraphicFramePr>
+              <a:graphicFrameLocks xmlns:a="http://schemas.openxmlformats.org/drawingml/2006/main" noChangeAspect="1"/>
+            </wp:cNvGraphicFramePr>
+            <a:graphic xmlns:a="http://schemas.openxmlformats.org/drawingml/2006/main">
+              <a:graphicData uri="http://schemas.openxmlformats.org/drawingml/2006/picture">
+                <pic:pic xmlns:pic="http://schemas.openxmlformats.org/drawingml/2006/picture">
+                  <pic:nvPicPr>
+                    <pic:cNvPr id="120" name="Imagem 120"/>
+                    <pic:cNvPicPr/>
+                  </pic:nvPicPr>
+                  <pic:blipFill>
+                    <a:blip r:embed="rId219"/>
+                    <a:stretch>
+                      <a:fillRect/>
+                    </a:stretch>
+                  </pic:blipFill>
+                  <pic:spPr>
+                    <a:xfrm>
+                      <a:off x="0" y="0"/>
+                      <a:ext cx="2160000" cy="2160000"/>
+                    </a:xfrm>
+                    <a:prstGeom prst="rect">
+                      <a:avLst/>
+                    </a:prstGeom>
+                    <a:ln w="6350">
+                      <a:solidFill>
+                        <a:srgbClr val="A6A6A6"/>
+                      </a:solidFill>
+                    </a:ln>
+                  </pic:spPr>
+                </pic:pic>
+              </a:graphicData>
+            </a:graphic>
+          </wp:inline>
+        </w:drawing>
+      </w:r>
+    </w:p>
     <w:p>
       <w:pPr>
         <w:pStyle w:val="Legenda"/>
         <w:spacing w:before="80" w:after="240"/>
+      </w:pPr>
+      <w:bookmarkStart w:id="205" w:name="_TocCapFqr"/>
+      <w:bookmarkStart w:id="206" w:name="_RefFig_qr"/>
+      <w:r>
+        <w:t xml:space="preserve">Figura </w:t>
+      </w:r>
+      <w:r>
+        <w:fldChar w:fldCharType="begin"/>
+      </w:r>
+      <w:r>
+        <w:instrText xml:space="preserve"> SEQ Figura \* ARABIC </w:instrText>
+      </w:r>
+      <w:r>
+        <w:fldChar w:fldCharType="separate"/>
+      </w:r>
+      <w:r>
+        <w:rPr>
+          <w:noProof/>
+        </w:rPr>
+        <w:t>20</w:t>
+      </w:r>
+      <w:r>
+        <w:fldChar w:fldCharType="end"/>
+      </w:r>
+      <w:bookmarkEnd w:id="206"/>
+      <w:r>
+        <w:t xml:space="preserve">: Código QR com a ligação para o vídeo de demonstração do pipeline.</w:t>
+      </w:r>
+      <w:bookmarkEnd w:id="205"/>
+    </w:p>
+    <w:p>
+      <w:pPr>
         <w:ind w:firstLine="0"/>
         <w:jc w:val="center"/>
       </w:pPr>
-      <w:bookmarkStart w:id="205" w:name="_TocCapFqr"/>
-      <w:bookmarkStart w:id="206" w:name="_RefFig_qr"/>
-      <w:r>
-        <w:t xml:space="preserve">Figura </w:t>
-      </w:r>
-      <w:r>
-        <w:fldChar w:fldCharType="begin"/>
-      </w:r>
-      <w:r>
-        <w:instrText xml:space="preserve"> SEQ Figura \* ARABIC </w:instrText>
-      </w:r>
-      <w:r>
-        <w:fldChar w:fldCharType="separate"/>
-      </w:r>
-      <w:r>
-        <w:rPr>
-          <w:noProof/>
-        </w:rPr>
-        <w:t>20</w:t>
-      </w:r>
-      <w:r>
-        <w:fldChar w:fldCharType="end"/>
-      </w:r>
-      <w:bookmarkEnd w:id="206"/>
-      <w:r>
-        <w:t xml:space="preserve">: Código QR com a ligação para o vídeo de demonstração do pipeline.</w:t>
-      </w:r>
-      <w:bookmarkEnd w:id="205"/>
-    </w:p>
-    <w:p>
-      <w:pPr>
-        <w:ind w:firstLine="0"/>
-        <w:jc w:val="center"/>
-      </w:pPr>
       <w:r>
         <w:rPr>
           <w:b/>
@@ -21746,13 +21609,29 @@
         <w:t xml:space="preserve">URL do vídeo:</w:t>
       </w:r>
       <w:r>
-        <w:t xml:space="preserve"> </w:t>
-      </w:r>
-      <w:r>
-        <w:rPr>
-          <w:highlight w:val="yellow"/>
-        </w:rPr>
-        <w:t xml:space="preserve">https://… (a preencher)</w:t>
+        <w:t xml:space="preserve"> https://scanned.page/p/Yjo87I</w:t>
+      </w:r>
+    </w:p>
+    <w:p>
+      <w:r>
+        <w:rPr>
+          <w:b/>
+          <w:bCs/>
+        </w:rPr>
+        <w:t xml:space="preserve">Nota sobre a validade da ligação.</w:t>
+      </w:r>
+      <w:r>
+        <w:t xml:space="preserve"> O vídeo está alojado num serviço de partilha temporária, pelo que a ligação e o código QR acima </w:t>
+      </w:r>
+      <w:r>
+        <w:rPr>
+          <w:b/>
+          <w:bCs/>
+        </w:rPr>
+        <w:t xml:space="preserve">expiram ao fim de dez dias</w:t>
+      </w:r>
+      <w:r>
+        <w:t xml:space="preserve"> a contar da data de entrega deste relatório. Caso o acesso já não esteja disponível no momento da leitura, o ficheiro de vídeo pode ser solicitado diretamente ao autor através do endereço de correio eletrónico indicado na página de identificação.</w:t>
       </w:r>
     </w:p>
     <w:p>
@@ -21982,6 +21861,37 @@
       </w:r>
       <w:r>
         <w:t xml:space="preserve"> cruzamento das novas ofertas com os índices já persistidos, de modo que os alertas do Telegram passem a indicar a poupança estimada e não apenas o salário bruto;</w:t>
+      </w:r>
+    </w:p>
+    <w:p>
+      <w:pPr>
+        <w:pStyle w:val="PargrafodaLista"/>
+        <w:numPr>
+          <w:ilvl w:val="0"/>
+          <w:numId w:val="3"/>
+        </w:numPr>
+        <w:spacing w:after="60"/>
+        <w:contextualSpacing w:val="0"/>
+      </w:pPr>
+      <w:r>
+        <w:rPr>
+          <w:b/>
+          <w:bCs/>
+        </w:rPr>
+        <w:t xml:space="preserve">Filtros interativos no dashboard:</w:t>
+      </w:r>
+      <w:r>
+        <w:t xml:space="preserve"> introdução de variáveis do tipo </w:t>
+      </w:r>
+      <w:r>
+        <w:rPr>
+          <w:i/>
+          <w:iCs/>
+        </w:rPr>
+        <w:t xml:space="preserve">Query</w:t>
+      </w:r>
+      <w:r>
+        <w:t xml:space="preserve"> no Grafana (por país e por nível de experiência), que permitiriam ao utilizador restringir todos os painéis em simultâneo, em vez da filtragem fixa em SQL;</w:t>
       </w:r>
     </w:p>
     <w:p>

</xml_diff>